<commit_message>
new workflow files added
</commit_message>
<xml_diff>
--- a/Requirement Folder/Simple Workflow.docx
+++ b/Requirement Folder/Simple Workflow.docx
@@ -6,6 +6,11 @@
       <w:r>
         <w:t>Simple Workflow</w:t>
       </w:r>
+    </w:p>
+    <w:p>
+      <w:r>
+        <w:t>(Workflow of customer)</w:t>
+      </w:r>
       <w:r>
         <w:br/>
         <w:t>1. User Authentication:</w:t>
@@ -13,7 +18,7 @@
     </w:p>
     <w:p>
       <w:r>
-        <w:t>Register, Login, Guest</w:t>
+        <w:t>Register, Login</w:t>
       </w:r>
     </w:p>
     <w:p>
@@ -22,72 +27,501 @@
       </w:r>
       <w:r>
         <w:br/>
-        <w:t>* search</w:t>
-      </w:r>
-    </w:p>
-    <w:p>
-      <w:r>
-        <w:t>*</w:t>
+      </w:r>
+      <w:r>
+        <w:t xml:space="preserve">-&gt; </w:t>
+      </w:r>
+      <w:r>
+        <w:t>search</w:t>
+      </w:r>
+    </w:p>
+    <w:p>
+      <w:r>
+        <w:t>-&gt;</w:t>
+      </w:r>
+      <w:r>
+        <w:t xml:space="preserve"> </w:t>
+      </w:r>
+      <w:r>
+        <w:t>book ticket</w:t>
+      </w:r>
+    </w:p>
+    <w:p>
+      <w:r>
+        <w:t>-&gt;</w:t>
+      </w:r>
+      <w:r>
+        <w:t xml:space="preserve"> </w:t>
+      </w:r>
+      <w:r>
+        <w:t>view profile</w:t>
+      </w:r>
+    </w:p>
+    <w:p>
+      <w:r>
+        <w:t>-&gt;</w:t>
+      </w:r>
+      <w:r>
+        <w:t xml:space="preserve"> </w:t>
+      </w:r>
+      <w:r>
+        <w:t>update profile</w:t>
+      </w:r>
+    </w:p>
+    <w:p>
+      <w:r>
+        <w:t>-&gt; view movie list</w:t>
+      </w:r>
+    </w:p>
+    <w:p>
+      <w:r>
+        <w:t>-&gt;</w:t>
+      </w:r>
+      <w:r>
+        <w:t xml:space="preserve"> </w:t>
+      </w:r>
+      <w:r>
+        <w:t>cancel ticket</w:t>
+      </w:r>
+    </w:p>
+    <w:p>
+      <w:r>
+        <w:t>-&gt;</w:t>
+      </w:r>
+      <w:r>
+        <w:t xml:space="preserve"> </w:t>
+      </w:r>
+      <w:r>
+        <w:t>log out</w:t>
+      </w:r>
+    </w:p>
+    <w:p>
+      <w:r>
+        <w:t>3. search</w:t>
+      </w:r>
+    </w:p>
+    <w:p>
+      <w:r>
+        <w:t>-&gt;</w:t>
+      </w:r>
+      <w:r>
+        <w:t xml:space="preserve"> </w:t>
+      </w:r>
+      <w:r>
+        <w:t>search by title, genre, language, theatre, city.</w:t>
+      </w:r>
+    </w:p>
+    <w:p>
+      <w:r>
+        <w:t>-&gt;</w:t>
+      </w:r>
+      <w:r>
+        <w:t xml:space="preserve"> </w:t>
+      </w:r>
+      <w:r>
+        <w:t>after selecting movie, they want to select city and list of theatre showed and they want to select one and choose time slot</w:t>
+      </w:r>
+    </w:p>
+    <w:p>
+      <w:r>
+        <w:t>-&gt;</w:t>
+      </w:r>
+      <w:r>
+        <w:t xml:space="preserve"> </w:t>
+      </w:r>
+      <w:r>
+        <w:t>Move to book module and seat module and payment</w:t>
+      </w:r>
+    </w:p>
+    <w:p>
+      <w:r>
+        <w:t>4. book ticket</w:t>
+      </w:r>
+    </w:p>
+    <w:p>
+      <w:r>
+        <w:t>-&gt;</w:t>
+      </w:r>
+      <w:r>
+        <w:t xml:space="preserve"> </w:t>
+      </w:r>
+      <w:r>
+        <w:t>Choose city</w:t>
+      </w:r>
+    </w:p>
+    <w:p>
+      <w:r>
+        <w:t>-&gt;</w:t>
+      </w:r>
+      <w:r>
+        <w:t xml:space="preserve"> select theatre</w:t>
+      </w:r>
+    </w:p>
+    <w:p>
+      <w:r>
+        <w:t>-&gt;</w:t>
+      </w:r>
+      <w:r>
+        <w:t xml:space="preserve"> choose movie</w:t>
+      </w:r>
+    </w:p>
+    <w:p>
+      <w:r>
+        <w:t>-&gt;</w:t>
+      </w:r>
+      <w:r>
+        <w:t xml:space="preserve"> </w:t>
+      </w:r>
+      <w:r>
+        <w:t>choose time slot</w:t>
+      </w:r>
+    </w:p>
+    <w:p>
+      <w:r>
+        <w:t>-&gt;</w:t>
+      </w:r>
+      <w:r>
+        <w:t xml:space="preserve"> </w:t>
+      </w:r>
+      <w:r>
+        <w:t xml:space="preserve">Move to book module and select seat module and payment </w:t>
+      </w:r>
+    </w:p>
+    <w:p>
+      <w:r>
+        <w:t>5. view profile</w:t>
+      </w:r>
+    </w:p>
+    <w:p>
+      <w:r>
+        <w:t>View the profile detail</w:t>
+      </w:r>
+    </w:p>
+    <w:p>
+      <w:r>
+        <w:t>6. update profile</w:t>
+      </w:r>
+    </w:p>
+    <w:p>
+      <w:r>
+        <w:t>Change the profile detail</w:t>
+      </w:r>
+    </w:p>
+    <w:p>
+      <w:r>
+        <w:t>7. cancel ticket</w:t>
+      </w:r>
+    </w:p>
+    <w:p>
+      <w:r>
+        <w:t>Cancel already booked ticket</w:t>
+      </w:r>
+    </w:p>
+    <w:p>
+      <w:r>
+        <w:lastRenderedPageBreak/>
+        <w:t>8. log out</w:t>
+      </w:r>
+    </w:p>
+    <w:p>
+      <w:r>
+        <w:t>(Workflow of administrator)</w:t>
+      </w:r>
+    </w:p>
+    <w:p>
+      <w:r>
+        <w:t>1. User Authentication:</w:t>
+      </w:r>
+    </w:p>
+    <w:p>
+      <w:r>
+        <w:t>Register, Login</w:t>
+      </w:r>
+    </w:p>
+    <w:p>
+      <w:r>
+        <w:t>2. System shows:</w:t>
+      </w:r>
+      <w:r>
+        <w:br/>
+        <w:t xml:space="preserve">-&gt; </w:t>
+      </w:r>
+      <w:r>
+        <w:t>Add movie</w:t>
+      </w:r>
+    </w:p>
+    <w:p>
+      <w:r>
+        <w:t xml:space="preserve">-&gt; </w:t>
+      </w:r>
+      <w:r>
+        <w:t>update movie</w:t>
+      </w:r>
+    </w:p>
+    <w:p>
+      <w:r>
+        <w:t xml:space="preserve">-&gt; </w:t>
+      </w:r>
+      <w:r>
+        <w:t>delete movie</w:t>
+      </w:r>
+    </w:p>
+    <w:p>
+      <w:r>
+        <w:t>-&gt; update profile</w:t>
+      </w:r>
+    </w:p>
+    <w:p>
+      <w:r>
+        <w:t xml:space="preserve">-&gt; </w:t>
+      </w:r>
+      <w:r>
+        <w:t>view profile</w:t>
+      </w:r>
+    </w:p>
+    <w:p>
+      <w:r>
+        <w:t xml:space="preserve">-&gt; </w:t>
+      </w:r>
+      <w:r>
+        <w:t>register officer account</w:t>
+      </w:r>
+    </w:p>
+    <w:p>
+      <w:r>
+        <w:t>-&gt;</w:t>
+      </w:r>
+      <w:r>
+        <w:t xml:space="preserve"> </w:t>
+      </w:r>
+      <w:r>
+        <w:t>View mo</w:t>
+      </w:r>
+      <w:r>
+        <w:t>vie list</w:t>
+      </w:r>
+    </w:p>
+    <w:p>
+      <w:r>
+        <w:t>-&gt;</w:t>
+      </w:r>
+      <w:r>
+        <w:t xml:space="preserve"> </w:t>
+      </w:r>
+      <w:r>
+        <w:t>View customer details report</w:t>
+      </w:r>
+    </w:p>
+    <w:p>
+      <w:r>
+        <w:t xml:space="preserve">-&gt; </w:t>
+      </w:r>
+      <w:r>
+        <w:t>View booking report</w:t>
+      </w:r>
+      <w:r>
+        <w:t xml:space="preserve"> </w:t>
+      </w:r>
+    </w:p>
+    <w:p>
+      <w:r>
+        <w:t>-&gt;</w:t>
+      </w:r>
+      <w:r>
+        <w:t xml:space="preserve"> </w:t>
+      </w:r>
+      <w:r>
+        <w:t xml:space="preserve">View booking report by date </w:t>
+      </w:r>
+    </w:p>
+    <w:p>
+      <w:r>
+        <w:t>-&gt;</w:t>
+      </w:r>
+      <w:r>
+        <w:t xml:space="preserve"> </w:t>
+      </w:r>
+      <w:r>
+        <w:t>View ticket cancellation report</w:t>
+      </w:r>
+    </w:p>
+    <w:p>
+      <w:r>
+        <w:t>-&gt; logout</w:t>
+      </w:r>
+    </w:p>
+    <w:p>
+      <w:r>
+        <w:t xml:space="preserve">(Workflow of </w:t>
+      </w:r>
+      <w:r>
+        <w:t>officer</w:t>
+      </w:r>
+      <w:r>
+        <w:t>)</w:t>
+      </w:r>
+    </w:p>
+    <w:p>
+      <w:r>
+        <w:t>1.user authentication</w:t>
+      </w:r>
+    </w:p>
+    <w:p>
+      <w:r>
+        <w:t>Login</w:t>
+      </w:r>
+    </w:p>
+    <w:p>
+      <w:r>
+        <w:t>2. system shows</w:t>
+      </w:r>
+    </w:p>
+    <w:p>
+      <w:r>
+        <w:t>-&gt;</w:t>
+      </w:r>
+      <w:r>
+        <w:t xml:space="preserve"> view movie list</w:t>
+      </w:r>
+    </w:p>
+    <w:p>
+      <w:r>
+        <w:t>-&gt;</w:t>
+      </w:r>
+      <w:r>
+        <w:t xml:space="preserve"> search</w:t>
+      </w:r>
+    </w:p>
+    <w:p>
+      <w:r>
+        <w:t>-&gt;</w:t>
+      </w:r>
+      <w:r>
+        <w:t xml:space="preserve"> book ticket</w:t>
+      </w:r>
+    </w:p>
+    <w:p>
+      <w:r>
+        <w:t>-&gt;</w:t>
+      </w:r>
+      <w:r>
+        <w:t xml:space="preserve"> cancel ticket</w:t>
+      </w:r>
+    </w:p>
+    <w:p>
+      <w:r>
+        <w:t>-&gt; logout</w:t>
+      </w:r>
+    </w:p>
+    <w:p>
+      <w:r>
+        <w:t>3. search</w:t>
+      </w:r>
+    </w:p>
+    <w:p>
+      <w:r>
+        <w:t>-&gt; search by title, genre, languag</w:t>
+      </w:r>
+      <w:r>
+        <w:t>e</w:t>
+      </w:r>
+      <w:r>
+        <w:t>.</w:t>
+      </w:r>
+    </w:p>
+    <w:p>
+      <w:r>
+        <w:lastRenderedPageBreak/>
+        <w:t>-&gt; after selecting movie, they want to select city and list of theatre showed and they want to select one and choose time slot</w:t>
+      </w:r>
+    </w:p>
+    <w:p>
+      <w:r>
+        <w:t xml:space="preserve">-&gt; Move to book module and seat module and </w:t>
       </w:r>
       <w:proofErr w:type="gramStart"/>
       <w:r>
-        <w:t>book</w:t>
+        <w:t>payment</w:t>
+      </w:r>
+      <w:r>
+        <w:t>(</w:t>
       </w:r>
       <w:proofErr w:type="gramEnd"/>
       <w:r>
-        <w:t xml:space="preserve"> ticket</w:t>
-      </w:r>
-    </w:p>
-    <w:p>
-      <w:r>
-        <w:t>*</w:t>
-      </w:r>
-      <w:proofErr w:type="gramStart"/>
-      <w:r>
-        <w:t>view</w:t>
-      </w:r>
-      <w:proofErr w:type="gramEnd"/>
-      <w:r>
-        <w:t xml:space="preserve"> profile</w:t>
-      </w:r>
-    </w:p>
-    <w:p>
-      <w:r>
-        <w:t>*</w:t>
-      </w:r>
-      <w:proofErr w:type="gramStart"/>
-      <w:r>
-        <w:t>update</w:t>
-      </w:r>
-      <w:proofErr w:type="gramEnd"/>
-      <w:r>
-        <w:t xml:space="preserve"> profile</w:t>
-      </w:r>
-    </w:p>
-    <w:p>
-      <w:r>
-        <w:t>*</w:t>
-      </w:r>
-      <w:proofErr w:type="gramStart"/>
-      <w:r>
-        <w:t>cancel</w:t>
-      </w:r>
-      <w:proofErr w:type="gramEnd"/>
-      <w:r>
-        <w:t xml:space="preserve"> ticket</w:t>
-      </w:r>
-    </w:p>
-    <w:p>
-      <w:r>
-        <w:t>*</w:t>
-      </w:r>
-      <w:proofErr w:type="gramStart"/>
-      <w:r>
-        <w:t>log</w:t>
-      </w:r>
-      <w:proofErr w:type="gramEnd"/>
-      <w:r>
-        <w:t xml:space="preserve"> out</w:t>
+        <w:t>cash also accepted)</w:t>
+      </w:r>
+    </w:p>
+    <w:p>
+      <w:r>
+        <w:t xml:space="preserve">4. </w:t>
+      </w:r>
+      <w:r>
+        <w:t>book ticket</w:t>
+      </w:r>
+    </w:p>
+    <w:p>
+      <w:r>
+        <w:t>-&gt; choose movie</w:t>
+      </w:r>
+    </w:p>
+    <w:p>
+      <w:r>
+        <w:t>-&gt; choose time slot</w:t>
+      </w:r>
+    </w:p>
+    <w:p>
+      <w:r>
+        <w:t xml:space="preserve">-&gt; Move to book module and select seat module and payment </w:t>
+      </w:r>
+    </w:p>
+    <w:p>
+      <w:r>
+        <w:t>5. cancel ticket</w:t>
+      </w:r>
+    </w:p>
+    <w:p>
+      <w:r>
+        <w:t xml:space="preserve">-&gt; </w:t>
+      </w:r>
+      <w:r>
+        <w:t>Cancel already booked ticket</w:t>
+      </w:r>
+    </w:p>
+    <w:p/>
+    <w:p>
+      <w:r>
+        <w:t xml:space="preserve">(Workflow of </w:t>
+      </w:r>
+      <w:r>
+        <w:t>guest</w:t>
+      </w:r>
+      <w:r>
+        <w:t>)</w:t>
+      </w:r>
+    </w:p>
+    <w:p>
+      <w:r>
+        <w:t>1.user authentication</w:t>
+      </w:r>
+    </w:p>
+    <w:p>
+      <w:r>
+        <w:t>Guest</w:t>
+      </w:r>
+    </w:p>
+    <w:p>
+      <w:r>
+        <w:t>2. system shows</w:t>
+      </w:r>
+    </w:p>
+    <w:p>
+      <w:r>
+        <w:t>-&gt; view movie list</w:t>
+      </w:r>
+    </w:p>
+    <w:p>
+      <w:r>
+        <w:t>-&gt; search</w:t>
       </w:r>
     </w:p>
     <w:p>
@@ -97,128 +531,18 @@
     </w:p>
     <w:p>
       <w:r>
-        <w:t xml:space="preserve">* </w:t>
-      </w:r>
-      <w:proofErr w:type="gramStart"/>
-      <w:r>
-        <w:t>search</w:t>
-      </w:r>
-      <w:proofErr w:type="gramEnd"/>
-      <w:r>
-        <w:t xml:space="preserve"> by title, genre, language, theatre, city.</w:t>
-      </w:r>
-      <w:r>
-        <w:br/>
-        <w:t>officer only have title, genre, language</w:t>
-      </w:r>
-    </w:p>
-    <w:p>
-      <w:r>
-        <w:t>*</w:t>
-      </w:r>
-      <w:proofErr w:type="gramStart"/>
-      <w:r>
-        <w:t>after</w:t>
-      </w:r>
-      <w:proofErr w:type="gramEnd"/>
-      <w:r>
-        <w:t xml:space="preserve"> selecting movie, they want to select city and list of theatre showed and they want to select one and choose time slot</w:t>
-      </w:r>
-    </w:p>
-    <w:p>
-      <w:r>
-        <w:t>Move to book module and seat module and payment</w:t>
-      </w:r>
-    </w:p>
-    <w:p>
-      <w:r>
-        <w:t>4. book ticket</w:t>
-      </w:r>
-    </w:p>
-    <w:p>
-      <w:r>
-        <w:t>* Choose city</w:t>
-      </w:r>
-    </w:p>
-    <w:p>
-      <w:r>
-        <w:t xml:space="preserve">* </w:t>
-      </w:r>
-      <w:proofErr w:type="gramStart"/>
-      <w:r>
-        <w:t>select</w:t>
-      </w:r>
-      <w:proofErr w:type="gramEnd"/>
-      <w:r>
-        <w:t xml:space="preserve"> theatre</w:t>
-      </w:r>
-    </w:p>
-    <w:p>
-      <w:r>
-        <w:t xml:space="preserve">* </w:t>
-      </w:r>
-      <w:proofErr w:type="gramStart"/>
-      <w:r>
-        <w:t>choose</w:t>
-      </w:r>
-      <w:proofErr w:type="gramEnd"/>
-      <w:r>
-        <w:t xml:space="preserve"> movie</w:t>
-      </w:r>
-    </w:p>
-    <w:p>
-      <w:r>
-        <w:t>*</w:t>
-      </w:r>
-      <w:proofErr w:type="gramStart"/>
-      <w:r>
-        <w:t>choose</w:t>
-      </w:r>
-      <w:proofErr w:type="gramEnd"/>
-      <w:r>
-        <w:t xml:space="preserve"> time slot</w:t>
-      </w:r>
-    </w:p>
-    <w:p>
-      <w:r>
-        <w:t xml:space="preserve">Move to book module and select seat module and payment </w:t>
-      </w:r>
-    </w:p>
-    <w:p>
-      <w:r>
-        <w:t>5. view profile</w:t>
-      </w:r>
-    </w:p>
-    <w:p>
-      <w:r>
-        <w:t>View the profile detail</w:t>
-      </w:r>
-    </w:p>
-    <w:p>
-      <w:r>
-        <w:t>6. update profile</w:t>
-      </w:r>
-    </w:p>
-    <w:p>
-      <w:r>
-        <w:t>Change the profile detail</w:t>
-      </w:r>
-    </w:p>
-    <w:p>
-      <w:r>
-        <w:t>7. cancel ticket</w:t>
-      </w:r>
-    </w:p>
-    <w:p>
-      <w:r>
-        <w:t>Cancel already booked ticket</w:t>
-      </w:r>
-    </w:p>
-    <w:p>
-      <w:r>
-        <w:t>8. log out</w:t>
-      </w:r>
-    </w:p>
+        <w:t>-&gt; search by title, genre, language, theatre, city.</w:t>
+      </w:r>
+    </w:p>
+    <w:p>
+      <w:r>
+        <w:t>-&gt; to book ticket, guest must register</w:t>
+      </w:r>
+    </w:p>
+    <w:p/>
+    <w:p/>
+    <w:p/>
+    <w:p/>
     <w:p/>
     <w:sectPr>
       <w:pgSz w:w="11906" w:h="16838"/>
@@ -228,6 +552,195 @@
     </w:sectPr>
   </w:body>
 </w:document>
+</file>
+
+<file path=word/numbering.xml><?xml version="1.0" encoding="utf-8"?>
+<w:numbering xmlns:wpc="http://schemas.microsoft.com/office/word/2010/wordprocessingCanvas" xmlns:cx="http://schemas.microsoft.com/office/drawing/2014/chartex" xmlns:cx1="http://schemas.microsoft.com/office/drawing/2015/9/8/chartex" xmlns:cx2="http://schemas.microsoft.com/office/drawing/2015/10/21/chartex" xmlns:cx3="http://schemas.microsoft.com/office/drawing/2016/5/9/chartex" xmlns:cx4="http://schemas.microsoft.com/office/drawing/2016/5/10/chartex" xmlns:cx5="http://schemas.microsoft.com/office/drawing/2016/5/11/chartex" xmlns:cx6="http://schemas.microsoft.com/office/drawing/2016/5/12/chartex" xmlns:cx7="http://schemas.microsoft.com/office/drawing/2016/5/13/chartex" xmlns:cx8="http://schemas.microsoft.com/office/drawing/2016/5/14/chartex" xmlns:mc="http://schemas.openxmlformats.org/markup-compatibility/2006" xmlns:aink="http://schemas.microsoft.com/office/drawing/2016/ink" xmlns:am3d="http://schemas.microsoft.com/office/drawing/2017/model3d" xmlns:o="urn:schemas-microsoft-com:office:office" xmlns:oel="http://schemas.microsoft.com/office/2019/extlst" xmlns:r="http://schemas.openxmlformats.org/officeDocument/2006/relationships" xmlns:m="http://schemas.openxmlformats.org/officeDocument/2006/math" xmlns:v="urn:schemas-microsoft-com:vml" xmlns:wp14="http://schemas.microsoft.com/office/word/2010/wordprocessingDrawing" xmlns:wp="http://schemas.openxmlformats.org/drawingml/2006/wordprocessingDrawing" xmlns:w10="urn:schemas-microsoft-com:office:word" xmlns:w="http://schemas.openxmlformats.org/wordprocessingml/2006/main" xmlns:w14="http://schemas.microsoft.com/office/word/2010/wordml" xmlns:w15="http://schemas.microsoft.com/office/word/2012/wordml" xmlns:w16cex="http://schemas.microsoft.com/office/word/2018/wordml/cex" xmlns:w16cid="http://schemas.microsoft.com/office/word/2016/wordml/cid" xmlns:w16="http://schemas.microsoft.com/office/word/2018/wordml" xmlns:w16du="http://schemas.microsoft.com/office/word/2023/wordml/word16du" xmlns:w16sdtdh="http://schemas.microsoft.com/office/word/2020/wordml/sdtdatahash" xmlns:w16sdtfl="http://schemas.microsoft.com/office/word/2024/wordml/sdtformatlock" xmlns:w16se="http://schemas.microsoft.com/office/word/2015/wordml/symex" xmlns:wpg="http://schemas.microsoft.com/office/word/2010/wordprocessingGroup" xmlns:wpi="http://schemas.microsoft.com/office/word/2010/wordprocessingInk" xmlns:wne="http://schemas.microsoft.com/office/word/2006/wordml" xmlns:wps="http://schemas.microsoft.com/office/word/2010/wordprocessingShape" mc:Ignorable="w14 w15 w16se w16cid w16 w16cex w16sdtdh w16sdtfl w16du wp14">
+  <w:abstractNum w:abstractNumId="0" w15:restartNumberingAfterBreak="0">
+    <w:nsid w:val="475A7E0D"/>
+    <w:multiLevelType w:val="hybridMultilevel"/>
+    <w:tmpl w:val="4CD64472"/>
+    <w:lvl w:ilvl="0" w:tplc="4009000F">
+      <w:start w:val="1"/>
+      <w:numFmt w:val="decimal"/>
+      <w:lvlText w:val="%1."/>
+      <w:lvlJc w:val="left"/>
+      <w:pPr>
+        <w:ind w:left="720" w:hanging="360"/>
+      </w:pPr>
+      <w:rPr>
+        <w:rFonts w:hint="default"/>
+      </w:rPr>
+    </w:lvl>
+    <w:lvl w:ilvl="1" w:tplc="40090019" w:tentative="1">
+      <w:start w:val="1"/>
+      <w:numFmt w:val="lowerLetter"/>
+      <w:lvlText w:val="%2."/>
+      <w:lvlJc w:val="left"/>
+      <w:pPr>
+        <w:ind w:left="1440" w:hanging="360"/>
+      </w:pPr>
+    </w:lvl>
+    <w:lvl w:ilvl="2" w:tplc="4009001B" w:tentative="1">
+      <w:start w:val="1"/>
+      <w:numFmt w:val="lowerRoman"/>
+      <w:lvlText w:val="%3."/>
+      <w:lvlJc w:val="right"/>
+      <w:pPr>
+        <w:ind w:left="2160" w:hanging="180"/>
+      </w:pPr>
+    </w:lvl>
+    <w:lvl w:ilvl="3" w:tplc="4009000F" w:tentative="1">
+      <w:start w:val="1"/>
+      <w:numFmt w:val="decimal"/>
+      <w:lvlText w:val="%4."/>
+      <w:lvlJc w:val="left"/>
+      <w:pPr>
+        <w:ind w:left="2880" w:hanging="360"/>
+      </w:pPr>
+    </w:lvl>
+    <w:lvl w:ilvl="4" w:tplc="40090019" w:tentative="1">
+      <w:start w:val="1"/>
+      <w:numFmt w:val="lowerLetter"/>
+      <w:lvlText w:val="%5."/>
+      <w:lvlJc w:val="left"/>
+      <w:pPr>
+        <w:ind w:left="3600" w:hanging="360"/>
+      </w:pPr>
+    </w:lvl>
+    <w:lvl w:ilvl="5" w:tplc="4009001B" w:tentative="1">
+      <w:start w:val="1"/>
+      <w:numFmt w:val="lowerRoman"/>
+      <w:lvlText w:val="%6."/>
+      <w:lvlJc w:val="right"/>
+      <w:pPr>
+        <w:ind w:left="4320" w:hanging="180"/>
+      </w:pPr>
+    </w:lvl>
+    <w:lvl w:ilvl="6" w:tplc="4009000F" w:tentative="1">
+      <w:start w:val="1"/>
+      <w:numFmt w:val="decimal"/>
+      <w:lvlText w:val="%7."/>
+      <w:lvlJc w:val="left"/>
+      <w:pPr>
+        <w:ind w:left="5040" w:hanging="360"/>
+      </w:pPr>
+    </w:lvl>
+    <w:lvl w:ilvl="7" w:tplc="40090019" w:tentative="1">
+      <w:start w:val="1"/>
+      <w:numFmt w:val="lowerLetter"/>
+      <w:lvlText w:val="%8."/>
+      <w:lvlJc w:val="left"/>
+      <w:pPr>
+        <w:ind w:left="5760" w:hanging="360"/>
+      </w:pPr>
+    </w:lvl>
+    <w:lvl w:ilvl="8" w:tplc="4009001B" w:tentative="1">
+      <w:start w:val="1"/>
+      <w:numFmt w:val="lowerRoman"/>
+      <w:lvlText w:val="%9."/>
+      <w:lvlJc w:val="right"/>
+      <w:pPr>
+        <w:ind w:left="6480" w:hanging="180"/>
+      </w:pPr>
+    </w:lvl>
+  </w:abstractNum>
+  <w:abstractNum w:abstractNumId="1" w15:restartNumberingAfterBreak="0">
+    <w:nsid w:val="65E24F6D"/>
+    <w:multiLevelType w:val="hybridMultilevel"/>
+    <w:tmpl w:val="58088608"/>
+    <w:lvl w:ilvl="0" w:tplc="4009000F">
+      <w:start w:val="1"/>
+      <w:numFmt w:val="decimal"/>
+      <w:lvlText w:val="%1."/>
+      <w:lvlJc w:val="left"/>
+      <w:pPr>
+        <w:ind w:left="720" w:hanging="360"/>
+      </w:pPr>
+      <w:rPr>
+        <w:rFonts w:hint="default"/>
+      </w:rPr>
+    </w:lvl>
+    <w:lvl w:ilvl="1" w:tplc="40090019" w:tentative="1">
+      <w:start w:val="1"/>
+      <w:numFmt w:val="lowerLetter"/>
+      <w:lvlText w:val="%2."/>
+      <w:lvlJc w:val="left"/>
+      <w:pPr>
+        <w:ind w:left="1440" w:hanging="360"/>
+      </w:pPr>
+    </w:lvl>
+    <w:lvl w:ilvl="2" w:tplc="4009001B" w:tentative="1">
+      <w:start w:val="1"/>
+      <w:numFmt w:val="lowerRoman"/>
+      <w:lvlText w:val="%3."/>
+      <w:lvlJc w:val="right"/>
+      <w:pPr>
+        <w:ind w:left="2160" w:hanging="180"/>
+      </w:pPr>
+    </w:lvl>
+    <w:lvl w:ilvl="3" w:tplc="4009000F" w:tentative="1">
+      <w:start w:val="1"/>
+      <w:numFmt w:val="decimal"/>
+      <w:lvlText w:val="%4."/>
+      <w:lvlJc w:val="left"/>
+      <w:pPr>
+        <w:ind w:left="2880" w:hanging="360"/>
+      </w:pPr>
+    </w:lvl>
+    <w:lvl w:ilvl="4" w:tplc="40090019" w:tentative="1">
+      <w:start w:val="1"/>
+      <w:numFmt w:val="lowerLetter"/>
+      <w:lvlText w:val="%5."/>
+      <w:lvlJc w:val="left"/>
+      <w:pPr>
+        <w:ind w:left="3600" w:hanging="360"/>
+      </w:pPr>
+    </w:lvl>
+    <w:lvl w:ilvl="5" w:tplc="4009001B" w:tentative="1">
+      <w:start w:val="1"/>
+      <w:numFmt w:val="lowerRoman"/>
+      <w:lvlText w:val="%6."/>
+      <w:lvlJc w:val="right"/>
+      <w:pPr>
+        <w:ind w:left="4320" w:hanging="180"/>
+      </w:pPr>
+    </w:lvl>
+    <w:lvl w:ilvl="6" w:tplc="4009000F" w:tentative="1">
+      <w:start w:val="1"/>
+      <w:numFmt w:val="decimal"/>
+      <w:lvlText w:val="%7."/>
+      <w:lvlJc w:val="left"/>
+      <w:pPr>
+        <w:ind w:left="5040" w:hanging="360"/>
+      </w:pPr>
+    </w:lvl>
+    <w:lvl w:ilvl="7" w:tplc="40090019" w:tentative="1">
+      <w:start w:val="1"/>
+      <w:numFmt w:val="lowerLetter"/>
+      <w:lvlText w:val="%8."/>
+      <w:lvlJc w:val="left"/>
+      <w:pPr>
+        <w:ind w:left="5760" w:hanging="360"/>
+      </w:pPr>
+    </w:lvl>
+    <w:lvl w:ilvl="8" w:tplc="4009001B" w:tentative="1">
+      <w:start w:val="1"/>
+      <w:numFmt w:val="lowerRoman"/>
+      <w:lvlText w:val="%9."/>
+      <w:lvlJc w:val="right"/>
+      <w:pPr>
+        <w:ind w:left="6480" w:hanging="180"/>
+      </w:pPr>
+    </w:lvl>
+  </w:abstractNum>
+  <w:num w:numId="1" w16cid:durableId="1476407833">
+    <w:abstractNumId w:val="1"/>
+  </w:num>
+  <w:num w:numId="2" w16cid:durableId="337586179">
+    <w:abstractNumId w:val="0"/>
+  </w:num>
+</w:numbering>
 </file>
 
 <file path=word/styles.xml><?xml version="1.0" encoding="utf-8"?>
@@ -630,6 +1143,7 @@
   <w:style w:type="paragraph" w:default="1" w:styleId="Normal">
     <w:name w:val="Normal"/>
     <w:qFormat/>
+    <w:rsid w:val="007C0265"/>
   </w:style>
   <w:style w:type="paragraph" w:styleId="Heading1">
     <w:name w:val="heading 1"/>
@@ -833,7 +1347,6 @@
   <w:style w:type="character" w:default="1" w:styleId="DefaultParagraphFont">
     <w:name w:val="Default Paragraph Font"/>
     <w:uiPriority w:val="1"/>
-    <w:semiHidden/>
     <w:unhideWhenUsed/>
   </w:style>
   <w:style w:type="table" w:default="1" w:styleId="TableNormal">

</xml_diff>